<commit_message>
Replace public capabilities with GSN core set
</commit_message>
<xml_diff>
--- a/docs/community-setup-pack/GSN_COMMUNITY_SETUP_QR_DOWNLOAD_INDEX_2026-09-14.docx
+++ b/docs/community-setup-pack/GSN_COMMUNITY_SETUP_QR_DOWNLOAD_INDEX_2026-09-14.docx
@@ -107,12 +107,12 @@
           <w:b/>
           <w:color w:val="0B2545"/>
         </w:rPr>
-        <w:t>Community Setup Deployment Pack Index</w:t>
+        <w:t>GSN Core Capability Set</w:t>
       </w:r>
     </w:p>
     <w:p>
       <w:r>
-        <w:t>Audience: GSN setup team and community leaders</w:t>
+        <w:t>Audience: Public app surfaces, first conversations and client handover</w:t>
       </w:r>
     </w:p>
     <w:p>
@@ -131,7 +131,7 @@
               <a:graphicData uri="http://schemas.openxmlformats.org/drawingml/2006/picture">
                 <pic:pic>
                   <pic:nvPicPr>
-                    <pic:cNvPr id="0" name="deployment-pack-index.png"/>
+                    <pic:cNvPr id="0" name="core-capability-set.png"/>
                     <pic:cNvPicPr/>
                   </pic:nvPicPr>
                   <pic:blipFill>
@@ -162,7 +162,7 @@
         <w:rPr>
           <w:sz w:val="14"/>
         </w:rPr>
-        <w:t>https://github.com/chumanwafor216-svg/gmfn-mvp/blob/main/docs/community-setup-pack/GSN_COMMUNITY_SETUP_DEPLOYMENT_PACK_INDEX_2026-09-14.md</w:t>
+        <w:t>https://github.com/chumanwafor216-svg/gmfn-mvp/blob/main/docs/community-setup-pack/GSN_CORE_CAPABILITY_SET_2026-09-14.md</w:t>
       </w:r>
     </w:p>
     <w:p>
@@ -174,12 +174,12 @@
           <w:b/>
           <w:color w:val="0B2545"/>
         </w:rPr>
-        <w:t>Client Handover Map</w:t>
+        <w:t>Community Setup Deployment Pack Index</w:t>
       </w:r>
     </w:p>
     <w:p>
       <w:r>
-        <w:t>Audience: Community owners, coordinators and client admins</w:t>
+        <w:t>Audience: GSN setup team and community leaders</w:t>
       </w:r>
     </w:p>
     <w:p>
@@ -198,7 +198,7 @@
               <a:graphicData uri="http://schemas.openxmlformats.org/drawingml/2006/picture">
                 <pic:pic>
                   <pic:nvPicPr>
-                    <pic:cNvPr id="0" name="client-handover-map.png"/>
+                    <pic:cNvPr id="0" name="deployment-pack-index.png"/>
                     <pic:cNvPicPr/>
                   </pic:nvPicPr>
                   <pic:blipFill>
@@ -229,12 +229,79 @@
         <w:rPr>
           <w:sz w:val="14"/>
         </w:rPr>
-        <w:t>https://github.com/chumanwafor216-svg/gmfn-mvp/blob/main/docs/community-setup-pack/GSN_COMMUNITY_SETUP_CLIENT_HANDOVER_MAP_2026-09-14.md</w:t>
+        <w:t>https://github.com/chumanwafor216-svg/gmfn-mvp/blob/main/docs/community-setup-pack/GSN_COMMUNITY_SETUP_DEPLOYMENT_PACK_INDEX_2026-09-14.md</w:t>
       </w:r>
     </w:p>
     <w:p>
       <w:r>
         <w:br w:type="page"/>
+      </w:r>
+    </w:p>
+    <w:p>
+      <w:pPr>
+        <w:jc w:val="center"/>
+      </w:pPr>
+      <w:r>
+        <w:rPr>
+          <w:b/>
+          <w:color w:val="0B2545"/>
+        </w:rPr>
+        <w:t>Client Handover Map</w:t>
+      </w:r>
+    </w:p>
+    <w:p>
+      <w:r>
+        <w:t>Audience: Community owners, coordinators and client admins</w:t>
+      </w:r>
+    </w:p>
+    <w:p>
+      <w:pPr>
+        <w:jc w:val="center"/>
+      </w:pPr>
+      <w:r>
+        <w:drawing>
+          <wp:inline xmlns:a="http://schemas.openxmlformats.org/drawingml/2006/main" xmlns:pic="http://schemas.openxmlformats.org/drawingml/2006/picture">
+            <wp:extent cx="1143000" cy="1143000"/>
+            <wp:docPr id="4" name="Picture 4"/>
+            <wp:cNvGraphicFramePr>
+              <a:graphicFrameLocks noChangeAspect="1"/>
+            </wp:cNvGraphicFramePr>
+            <a:graphic>
+              <a:graphicData uri="http://schemas.openxmlformats.org/drawingml/2006/picture">
+                <pic:pic>
+                  <pic:nvPicPr>
+                    <pic:cNvPr id="0" name="client-handover-map.png"/>
+                    <pic:cNvPicPr/>
+                  </pic:nvPicPr>
+                  <pic:blipFill>
+                    <a:blip r:embed="rId14"/>
+                    <a:stretch>
+                      <a:fillRect/>
+                    </a:stretch>
+                  </pic:blipFill>
+                  <pic:spPr>
+                    <a:xfrm>
+                      <a:off x="0" y="0"/>
+                      <a:ext cx="1143000" cy="1143000"/>
+                    </a:xfrm>
+                    <a:prstGeom prst="rect"/>
+                  </pic:spPr>
+                </pic:pic>
+              </a:graphicData>
+            </a:graphic>
+          </wp:inline>
+        </w:drawing>
+      </w:r>
+    </w:p>
+    <w:p>
+      <w:pPr>
+        <w:jc w:val="center"/>
+      </w:pPr>
+      <w:r>
+        <w:rPr>
+          <w:sz w:val="14"/>
+        </w:rPr>
+        <w:t>https://github.com/chumanwafor216-svg/gmfn-mvp/blob/main/docs/community-setup-pack/GSN_COMMUNITY_SETUP_CLIENT_HANDOVER_MAP_2026-09-14.md</w:t>
       </w:r>
     </w:p>
     <w:p>
@@ -262,7 +329,7 @@
         <w:drawing>
           <wp:inline xmlns:a="http://schemas.openxmlformats.org/drawingml/2006/main" xmlns:pic="http://schemas.openxmlformats.org/drawingml/2006/picture">
             <wp:extent cx="1143000" cy="1143000"/>
-            <wp:docPr id="4" name="Picture 4"/>
+            <wp:docPr id="5" name="Picture 5"/>
             <wp:cNvGraphicFramePr>
               <a:graphicFrameLocks noChangeAspect="1"/>
             </wp:cNvGraphicFramePr>
@@ -274,7 +341,7 @@
                     <pic:cNvPicPr/>
                   </pic:nvPicPr>
                   <pic:blipFill>
-                    <a:blip r:embed="rId14"/>
+                    <a:blip r:embed="rId15"/>
                     <a:stretch>
                       <a:fillRect/>
                     </a:stretch>
@@ -329,7 +396,7 @@
         <w:drawing>
           <wp:inline xmlns:a="http://schemas.openxmlformats.org/drawingml/2006/main" xmlns:pic="http://schemas.openxmlformats.org/drawingml/2006/picture">
             <wp:extent cx="1143000" cy="1143000"/>
-            <wp:docPr id="5" name="Picture 5"/>
+            <wp:docPr id="6" name="Picture 6"/>
             <wp:cNvGraphicFramePr>
               <a:graphicFrameLocks noChangeAspect="1"/>
             </wp:cNvGraphicFramePr>
@@ -341,7 +408,7 @@
                     <pic:cNvPicPr/>
                   </pic:nvPicPr>
                   <pic:blipFill>
-                    <a:blip r:embed="rId15"/>
+                    <a:blip r:embed="rId16"/>
                     <a:stretch>
                       <a:fillRect/>
                     </a:stretch>
@@ -372,6 +439,11 @@
       </w:r>
     </w:p>
     <w:p>
+      <w:r>
+        <w:br w:type="page"/>
+      </w:r>
+    </w:p>
+    <w:p>
       <w:pPr>
         <w:jc w:val="center"/>
       </w:pPr>
@@ -396,7 +468,7 @@
         <w:drawing>
           <wp:inline xmlns:a="http://schemas.openxmlformats.org/drawingml/2006/main" xmlns:pic="http://schemas.openxmlformats.org/drawingml/2006/picture">
             <wp:extent cx="1143000" cy="1143000"/>
-            <wp:docPr id="6" name="Picture 6"/>
+            <wp:docPr id="7" name="Picture 7"/>
             <wp:cNvGraphicFramePr>
               <a:graphicFrameLocks noChangeAspect="1"/>
             </wp:cNvGraphicFramePr>
@@ -408,7 +480,7 @@
                     <pic:cNvPicPr/>
                   </pic:nvPicPr>
                   <pic:blipFill>
-                    <a:blip r:embed="rId16"/>
+                    <a:blip r:embed="rId17"/>
                     <a:stretch>
                       <a:fillRect/>
                     </a:stretch>
@@ -439,11 +511,6 @@
       </w:r>
     </w:p>
     <w:p>
-      <w:r>
-        <w:br w:type="page"/>
-      </w:r>
-    </w:p>
-    <w:p>
       <w:pPr>
         <w:jc w:val="center"/>
       </w:pPr>
@@ -468,7 +535,7 @@
         <w:drawing>
           <wp:inline xmlns:a="http://schemas.openxmlformats.org/drawingml/2006/main" xmlns:pic="http://schemas.openxmlformats.org/drawingml/2006/picture">
             <wp:extent cx="1143000" cy="1143000"/>
-            <wp:docPr id="7" name="Picture 7"/>
+            <wp:docPr id="8" name="Picture 8"/>
             <wp:cNvGraphicFramePr>
               <a:graphicFrameLocks noChangeAspect="1"/>
             </wp:cNvGraphicFramePr>
@@ -480,7 +547,7 @@
                     <pic:cNvPicPr/>
                   </pic:nvPicPr>
                   <pic:blipFill>
-                    <a:blip r:embed="rId17"/>
+                    <a:blip r:embed="rId18"/>
                     <a:stretch>
                       <a:fillRect/>
                     </a:stretch>
@@ -535,7 +602,7 @@
         <w:drawing>
           <wp:inline xmlns:a="http://schemas.openxmlformats.org/drawingml/2006/main" xmlns:pic="http://schemas.openxmlformats.org/drawingml/2006/picture">
             <wp:extent cx="1143000" cy="1143000"/>
-            <wp:docPr id="8" name="Picture 8"/>
+            <wp:docPr id="9" name="Picture 9"/>
             <wp:cNvGraphicFramePr>
               <a:graphicFrameLocks noChangeAspect="1"/>
             </wp:cNvGraphicFramePr>
@@ -547,7 +614,7 @@
                     <pic:cNvPicPr/>
                   </pic:nvPicPr>
                   <pic:blipFill>
-                    <a:blip r:embed="rId18"/>
+                    <a:blip r:embed="rId19"/>
                     <a:stretch>
                       <a:fillRect/>
                     </a:stretch>
@@ -578,6 +645,11 @@
       </w:r>
     </w:p>
     <w:p>
+      <w:r>
+        <w:br w:type="page"/>
+      </w:r>
+    </w:p>
+    <w:p>
       <w:pPr>
         <w:jc w:val="center"/>
       </w:pPr>
@@ -602,7 +674,7 @@
         <w:drawing>
           <wp:inline xmlns:a="http://schemas.openxmlformats.org/drawingml/2006/main" xmlns:pic="http://schemas.openxmlformats.org/drawingml/2006/picture">
             <wp:extent cx="1143000" cy="1143000"/>
-            <wp:docPr id="9" name="Picture 9"/>
+            <wp:docPr id="10" name="Picture 10"/>
             <wp:cNvGraphicFramePr>
               <a:graphicFrameLocks noChangeAspect="1"/>
             </wp:cNvGraphicFramePr>
@@ -614,7 +686,7 @@
                     <pic:cNvPicPr/>
                   </pic:nvPicPr>
                   <pic:blipFill>
-                    <a:blip r:embed="rId19"/>
+                    <a:blip r:embed="rId20"/>
                     <a:stretch>
                       <a:fillRect/>
                     </a:stretch>
@@ -645,11 +717,6 @@
       </w:r>
     </w:p>
     <w:p>
-      <w:r>
-        <w:br w:type="page"/>
-      </w:r>
-    </w:p>
-    <w:p>
       <w:pPr>
         <w:jc w:val="center"/>
       </w:pPr>
@@ -674,7 +741,7 @@
         <w:drawing>
           <wp:inline xmlns:a="http://schemas.openxmlformats.org/drawingml/2006/main" xmlns:pic="http://schemas.openxmlformats.org/drawingml/2006/picture">
             <wp:extent cx="1143000" cy="1143000"/>
-            <wp:docPr id="10" name="Picture 10"/>
+            <wp:docPr id="11" name="Picture 11"/>
             <wp:cNvGraphicFramePr>
               <a:graphicFrameLocks noChangeAspect="1"/>
             </wp:cNvGraphicFramePr>
@@ -686,7 +753,7 @@
                     <pic:cNvPicPr/>
                   </pic:nvPicPr>
                   <pic:blipFill>
-                    <a:blip r:embed="rId20"/>
+                    <a:blip r:embed="rId21"/>
                     <a:stretch>
                       <a:fillRect/>
                     </a:stretch>
@@ -741,7 +808,7 @@
         <w:drawing>
           <wp:inline xmlns:a="http://schemas.openxmlformats.org/drawingml/2006/main" xmlns:pic="http://schemas.openxmlformats.org/drawingml/2006/picture">
             <wp:extent cx="1143000" cy="1143000"/>
-            <wp:docPr id="11" name="Picture 11"/>
+            <wp:docPr id="12" name="Picture 12"/>
             <wp:cNvGraphicFramePr>
               <a:graphicFrameLocks noChangeAspect="1"/>
             </wp:cNvGraphicFramePr>
@@ -753,7 +820,7 @@
                     <pic:cNvPicPr/>
                   </pic:nvPicPr>
                   <pic:blipFill>
-                    <a:blip r:embed="rId21"/>
+                    <a:blip r:embed="rId22"/>
                     <a:stretch>
                       <a:fillRect/>
                     </a:stretch>

</xml_diff>

<commit_message>
Use direct PDF links for setup pack QR targets
</commit_message>
<xml_diff>
--- a/docs/community-setup-pack/GSN_COMMUNITY_SETUP_QR_DOWNLOAD_INDEX_2026-09-14.docx
+++ b/docs/community-setup-pack/GSN_COMMUNITY_SETUP_QR_DOWNLOAD_INDEX_2026-09-14.docx
@@ -162,7 +162,7 @@
         <w:rPr>
           <w:sz w:val="14"/>
         </w:rPr>
-        <w:t>https://github.com/chumanwafor216-svg/gmfn-mvp/blob/main/docs/community-setup-pack/GSN_CORE_CAPABILITY_SET_2026-09-14.md</w:t>
+        <w:t>https://raw.githubusercontent.com/chumanwafor216-svg/gmfn-mvp/main/docs/community-setup-pack/GSN_CORE_CAPABILITY_SET_2026-09-14.pdf</w:t>
       </w:r>
     </w:p>
     <w:p>
@@ -229,7 +229,7 @@
         <w:rPr>
           <w:sz w:val="14"/>
         </w:rPr>
-        <w:t>https://github.com/chumanwafor216-svg/gmfn-mvp/blob/main/docs/community-setup-pack/GSN_COMMUNITY_SETUP_DEPLOYMENT_PACK_INDEX_2026-09-14.md</w:t>
+        <w:t>https://raw.githubusercontent.com/chumanwafor216-svg/gmfn-mvp/main/docs/community-setup-pack/GSN_COMMUNITY_SETUP_DEPLOYMENT_PACK_INDEX_2026-09-14.pdf</w:t>
       </w:r>
     </w:p>
     <w:p>
@@ -301,7 +301,7 @@
         <w:rPr>
           <w:sz w:val="14"/>
         </w:rPr>
-        <w:t>https://github.com/chumanwafor216-svg/gmfn-mvp/blob/main/docs/community-setup-pack/GSN_COMMUNITY_SETUP_CLIENT_HANDOVER_MAP_2026-09-14.md</w:t>
+        <w:t>https://raw.githubusercontent.com/chumanwafor216-svg/gmfn-mvp/main/docs/community-setup-pack/GSN_COMMUNITY_SETUP_CLIENT_HANDOVER_MAP_2026-09-14.pdf</w:t>
       </w:r>
     </w:p>
     <w:p>
@@ -368,7 +368,7 @@
         <w:rPr>
           <w:sz w:val="14"/>
         </w:rPr>
-        <w:t>https://github.com/chumanwafor216-svg/gmfn-mvp/blob/main/docs/community-setup-pack/GSN_COMMUNITY_SETUP_STORY_BANK_2026-09-14.md</w:t>
+        <w:t>https://raw.githubusercontent.com/chumanwafor216-svg/gmfn-mvp/main/docs/community-setup-pack/GSN_COMMUNITY_SETUP_STORY_BANK_2026-09-14.pdf</w:t>
       </w:r>
     </w:p>
     <w:p>

</xml_diff>